<commit_message>
Filing guide: copyright fees read from the Copyright Office and filled in
Co-Authored-By: Claude Fable 5.1 <noreply@anthropic.com>
Claude-Session: https://claude.ai/code/session_01FdLL4Wp3bi12KNX6zHRo7N
</commit_message>
<xml_diff>
--- a/EZvoxa Trademark and Copyright Filing Guide.docx
+++ b/EZvoxa Trademark and Copyright Filing Guide.docx
@@ -28,7 +28,7 @@
           <w:sz w:val="22"/>
           <w:szCs w:val="22"/>
         </w:rPr>
-        <w:t xml:space="preserve">For Frank Schaeffer, EZ Voice LLC. Prepared 10 September 2026. Every dollar figure in the trademark section was read that morning from the United States Patent and Trademark Office fee page (uspto.gov, fee schedule in force since January 18, 2025). Copyright fees are marked unverified because copyright.gov could not be reached; they will be filled in when it can. Screen labels marked "from memory" were not re-read from the site.</w:t>
+        <w:t xml:space="preserve">For Frank Schaeffer, EZ Voice LLC. Prepared 10 September 2026. Every dollar figure in the trademark section was read that morning from the United States Patent and Trademark Office fee page (uspto.gov, fee schedule in force since January 18, 2025). Copyright fees were read the same morning from the United States Copyright Office fee page (copyright.gov). Screen labels marked "from memory" were not re-read from the site.</w:t>
       </w:r>
     </w:p>
     <w:p>
@@ -112,7 +112,7 @@
           <w:sz w:val="22"/>
           <w:szCs w:val="22"/>
         </w:rPr>
-        <w:t xml:space="preserve">Register the copyright in the app as a computer program, and separately the neon icon set as artwork, both owned by EZ Voice LLC. Fees unverified until copyright.gov is opened. This is cheap and it is what lets you enforce ownership, which the sole-source letter to districts rests on.</w:t>
+        <w:t xml:space="preserve">Register the copyright in the app as a computer program ($65, Standard Application) and separately the neon icon set as artwork ($85 as a group of unpublished works, or $85 as a group of two-dimensional artworks), both owned by EZ Voice LLC. About $150 in all. This is what lets you enforce ownership, which the sole-source letter to districts rests on.</w:t>
       </w:r>
     </w:p>
     <w:p>
@@ -1597,9 +1597,598 @@
         <w:rPr>
           <w:rFonts w:ascii="Calibri" w:cs="Calibri" w:eastAsia="Calibri" w:hAnsi="Calibri"/>
         </w:rPr>
-        <w:t xml:space="preserve">Fees: unverified</w:t>
-      </w:r>
-    </w:p>
+        <w:t xml:space="preserve">Copyright fees, read from the Copyright Office on 10 September 2026</w:t>
+      </w:r>
+    </w:p>
+    <w:tbl>
+      <w:tblPr>
+        <w:tblW w:type="dxa" w:w="10000"/>
+        <w:tblBorders>
+          <w:top w:val="single" w:color="auto" w:sz="4"/>
+          <w:left w:val="single" w:color="auto" w:sz="4"/>
+          <w:bottom w:val="single" w:color="auto" w:sz="4"/>
+          <w:right w:val="single" w:color="auto" w:sz="4"/>
+          <w:insideH w:val="single" w:color="auto" w:sz="4"/>
+          <w:insideV w:val="single" w:color="auto" w:sz="4"/>
+        </w:tblBorders>
+      </w:tblPr>
+      <w:tblGrid>
+        <w:gridCol w:w="4300"/>
+        <w:gridCol w:w="1000"/>
+        <w:gridCol w:w="4700"/>
+      </w:tblGrid>
+      <w:tr>
+        <w:tc>
+          <w:tcPr>
+            <w:tcW w:type="dxa" w:w="4300"/>
+            <w:shd w:fill="E8E3DA" w:color="auto" w:val="clear"/>
+            <w:tcMar>
+              <w:top w:type="dxa" w:w="60"/>
+              <w:left w:type="dxa" w:w="80"/>
+              <w:bottom w:type="dxa" w:w="60"/>
+              <w:right w:type="dxa" w:w="80"/>
+            </w:tcMar>
+          </w:tcPr>
+          <w:p>
+            <w:r>
+              <w:rPr>
+                <w:rFonts w:ascii="Calibri" w:cs="Calibri" w:eastAsia="Calibri" w:hAnsi="Calibri"/>
+                <w:b/>
+                <w:bCs/>
+                <w:sz w:val="20"/>
+                <w:szCs w:val="20"/>
+              </w:rPr>
+              <w:t xml:space="preserve">Filing (electronic)</w:t>
+            </w:r>
+          </w:p>
+        </w:tc>
+        <w:tc>
+          <w:tcPr>
+            <w:tcW w:type="dxa" w:w="1000"/>
+            <w:shd w:fill="E8E3DA" w:color="auto" w:val="clear"/>
+            <w:tcMar>
+              <w:top w:type="dxa" w:w="60"/>
+              <w:left w:type="dxa" w:w="80"/>
+              <w:bottom w:type="dxa" w:w="60"/>
+              <w:right w:type="dxa" w:w="80"/>
+            </w:tcMar>
+          </w:tcPr>
+          <w:p>
+            <w:r>
+              <w:rPr>
+                <w:rFonts w:ascii="Calibri" w:cs="Calibri" w:eastAsia="Calibri" w:hAnsi="Calibri"/>
+                <w:b/>
+                <w:bCs/>
+                <w:sz w:val="20"/>
+                <w:szCs w:val="20"/>
+              </w:rPr>
+              <w:t xml:space="preserve">Fee</w:t>
+            </w:r>
+          </w:p>
+        </w:tc>
+        <w:tc>
+          <w:tcPr>
+            <w:tcW w:type="dxa" w:w="4700"/>
+            <w:shd w:fill="E8E3DA" w:color="auto" w:val="clear"/>
+            <w:tcMar>
+              <w:top w:type="dxa" w:w="60"/>
+              <w:left w:type="dxa" w:w="80"/>
+              <w:bottom w:type="dxa" w:w="60"/>
+              <w:right w:type="dxa" w:w="80"/>
+            </w:tcMar>
+          </w:tcPr>
+          <w:p>
+            <w:r>
+              <w:rPr>
+                <w:rFonts w:ascii="Calibri" w:cs="Calibri" w:eastAsia="Calibri" w:hAnsi="Calibri"/>
+                <w:b/>
+                <w:bCs/>
+                <w:sz w:val="20"/>
+                <w:szCs w:val="20"/>
+              </w:rPr>
+              <w:t xml:space="preserve">Use it for</w:t>
+            </w:r>
+          </w:p>
+        </w:tc>
+      </w:tr>
+      <w:tr>
+        <w:tc>
+          <w:tcPr>
+            <w:tcW w:type="dxa" w:w="4300"/>
+            <w:tcMar>
+              <w:top w:type="dxa" w:w="60"/>
+              <w:left w:type="dxa" w:w="80"/>
+              <w:bottom w:type="dxa" w:w="60"/>
+              <w:right w:type="dxa" w:w="80"/>
+            </w:tcMar>
+          </w:tcPr>
+          <w:p>
+            <w:r>
+              <w:rPr>
+                <w:rFonts w:ascii="Calibri" w:cs="Calibri" w:eastAsia="Calibri" w:hAnsi="Calibri"/>
+                <w:b w:val="false"/>
+                <w:bCs w:val="false"/>
+                <w:sz w:val="20"/>
+                <w:szCs w:val="20"/>
+              </w:rPr>
+              <w:t xml:space="preserve">Standard Application, one work</w:t>
+            </w:r>
+          </w:p>
+        </w:tc>
+        <w:tc>
+          <w:tcPr>
+            <w:tcW w:type="dxa" w:w="1000"/>
+            <w:tcMar>
+              <w:top w:type="dxa" w:w="60"/>
+              <w:left w:type="dxa" w:w="80"/>
+              <w:bottom w:type="dxa" w:w="60"/>
+              <w:right w:type="dxa" w:w="80"/>
+            </w:tcMar>
+          </w:tcPr>
+          <w:p>
+            <w:r>
+              <w:rPr>
+                <w:rFonts w:ascii="Calibri" w:cs="Calibri" w:eastAsia="Calibri" w:hAnsi="Calibri"/>
+                <w:b w:val="false"/>
+                <w:bCs w:val="false"/>
+                <w:sz w:val="20"/>
+                <w:szCs w:val="20"/>
+              </w:rPr>
+              <w:t xml:space="preserve">$65</w:t>
+            </w:r>
+          </w:p>
+        </w:tc>
+        <w:tc>
+          <w:tcPr>
+            <w:tcW w:type="dxa" w:w="4700"/>
+            <w:tcMar>
+              <w:top w:type="dxa" w:w="60"/>
+              <w:left w:type="dxa" w:w="80"/>
+              <w:bottom w:type="dxa" w:w="60"/>
+              <w:right w:type="dxa" w:w="80"/>
+            </w:tcMar>
+          </w:tcPr>
+          <w:p>
+            <w:r>
+              <w:rPr>
+                <w:rFonts w:ascii="Calibri" w:cs="Calibri" w:eastAsia="Calibri" w:hAnsi="Calibri"/>
+                <w:b w:val="false"/>
+                <w:bCs w:val="false"/>
+                <w:sz w:val="20"/>
+                <w:szCs w:val="20"/>
+              </w:rPr>
+              <w:t xml:space="preserve">The EZvoxa software, as a computer program, claimant EZ Voice LLC.</w:t>
+            </w:r>
+          </w:p>
+        </w:tc>
+      </w:tr>
+      <w:tr>
+        <w:tc>
+          <w:tcPr>
+            <w:tcW w:type="dxa" w:w="4300"/>
+            <w:tcMar>
+              <w:top w:type="dxa" w:w="60"/>
+              <w:left w:type="dxa" w:w="80"/>
+              <w:bottom w:type="dxa" w:w="60"/>
+              <w:right w:type="dxa" w:w="80"/>
+            </w:tcMar>
+          </w:tcPr>
+          <w:p>
+            <w:r>
+              <w:rPr>
+                <w:rFonts w:ascii="Calibri" w:cs="Calibri" w:eastAsia="Calibri" w:hAnsi="Calibri"/>
+                <w:b w:val="false"/>
+                <w:bCs w:val="false"/>
+                <w:sz w:val="20"/>
+                <w:szCs w:val="20"/>
+              </w:rPr>
+              <w:t xml:space="preserve">Single Application (one author, same claimant, one work, not for hire)</w:t>
+            </w:r>
+          </w:p>
+        </w:tc>
+        <w:tc>
+          <w:tcPr>
+            <w:tcW w:type="dxa" w:w="1000"/>
+            <w:tcMar>
+              <w:top w:type="dxa" w:w="60"/>
+              <w:left w:type="dxa" w:w="80"/>
+              <w:bottom w:type="dxa" w:w="60"/>
+              <w:right w:type="dxa" w:w="80"/>
+            </w:tcMar>
+          </w:tcPr>
+          <w:p>
+            <w:r>
+              <w:rPr>
+                <w:rFonts w:ascii="Calibri" w:cs="Calibri" w:eastAsia="Calibri" w:hAnsi="Calibri"/>
+                <w:b w:val="false"/>
+                <w:bCs w:val="false"/>
+                <w:sz w:val="20"/>
+                <w:szCs w:val="20"/>
+              </w:rPr>
+              <w:t xml:space="preserve">$45</w:t>
+            </w:r>
+          </w:p>
+        </w:tc>
+        <w:tc>
+          <w:tcPr>
+            <w:tcW w:type="dxa" w:w="4700"/>
+            <w:tcMar>
+              <w:top w:type="dxa" w:w="60"/>
+              <w:left w:type="dxa" w:w="80"/>
+              <w:bottom w:type="dxa" w:w="60"/>
+              <w:right w:type="dxa" w:w="80"/>
+            </w:tcMar>
+          </w:tcPr>
+          <w:p>
+            <w:r>
+              <w:rPr>
+                <w:rFonts w:ascii="Calibri" w:cs="Calibri" w:eastAsia="Calibri" w:hAnsi="Calibri"/>
+                <w:b w:val="false"/>
+                <w:bCs w:val="false"/>
+                <w:sz w:val="20"/>
+                <w:szCs w:val="20"/>
+              </w:rPr>
+              <w:t xml:space="preserve">Not ours: the claimant is the LLC, so the Standard Application applies.</w:t>
+            </w:r>
+          </w:p>
+        </w:tc>
+      </w:tr>
+      <w:tr>
+        <w:tc>
+          <w:tcPr>
+            <w:tcW w:type="dxa" w:w="4300"/>
+            <w:tcMar>
+              <w:top w:type="dxa" w:w="60"/>
+              <w:left w:type="dxa" w:w="80"/>
+              <w:bottom w:type="dxa" w:w="60"/>
+              <w:right w:type="dxa" w:w="80"/>
+            </w:tcMar>
+          </w:tcPr>
+          <w:p>
+            <w:r>
+              <w:rPr>
+                <w:rFonts w:ascii="Calibri" w:cs="Calibri" w:eastAsia="Calibri" w:hAnsi="Calibri"/>
+                <w:b w:val="false"/>
+                <w:bCs w:val="false"/>
+                <w:sz w:val="20"/>
+                <w:szCs w:val="20"/>
+              </w:rPr>
+              <w:t xml:space="preserve">Group of unpublished works</w:t>
+            </w:r>
+          </w:p>
+        </w:tc>
+        <w:tc>
+          <w:tcPr>
+            <w:tcW w:type="dxa" w:w="1000"/>
+            <w:tcMar>
+              <w:top w:type="dxa" w:w="60"/>
+              <w:left w:type="dxa" w:w="80"/>
+              <w:bottom w:type="dxa" w:w="60"/>
+              <w:right w:type="dxa" w:w="80"/>
+            </w:tcMar>
+          </w:tcPr>
+          <w:p>
+            <w:r>
+              <w:rPr>
+                <w:rFonts w:ascii="Calibri" w:cs="Calibri" w:eastAsia="Calibri" w:hAnsi="Calibri"/>
+                <w:b w:val="false"/>
+                <w:bCs w:val="false"/>
+                <w:sz w:val="20"/>
+                <w:szCs w:val="20"/>
+              </w:rPr>
+              <w:t xml:space="preserve">$85</w:t>
+            </w:r>
+          </w:p>
+        </w:tc>
+        <w:tc>
+          <w:tcPr>
+            <w:tcW w:type="dxa" w:w="4700"/>
+            <w:tcMar>
+              <w:top w:type="dxa" w:w="60"/>
+              <w:left w:type="dxa" w:w="80"/>
+              <w:bottom w:type="dxa" w:w="60"/>
+              <w:right w:type="dxa" w:w="80"/>
+            </w:tcMar>
+          </w:tcPr>
+          <w:p>
+            <w:r>
+              <w:rPr>
+                <w:rFonts w:ascii="Calibri" w:cs="Calibri" w:eastAsia="Calibri" w:hAnsi="Calibri"/>
+                <w:b w:val="false"/>
+                <w:bCs w:val="false"/>
+                <w:sz w:val="20"/>
+                <w:szCs w:val="20"/>
+              </w:rPr>
+              <w:t xml:space="preserve">The neon icon set, if registered before the app is on sale. From memory: up to ten works per group; check the limit on the form.</w:t>
+            </w:r>
+          </w:p>
+        </w:tc>
+      </w:tr>
+      <w:tr>
+        <w:tc>
+          <w:tcPr>
+            <w:tcW w:type="dxa" w:w="4300"/>
+            <w:tcMar>
+              <w:top w:type="dxa" w:w="60"/>
+              <w:left w:type="dxa" w:w="80"/>
+              <w:bottom w:type="dxa" w:w="60"/>
+              <w:right w:type="dxa" w:w="80"/>
+            </w:tcMar>
+          </w:tcPr>
+          <w:p>
+            <w:r>
+              <w:rPr>
+                <w:rFonts w:ascii="Calibri" w:cs="Calibri" w:eastAsia="Calibri" w:hAnsi="Calibri"/>
+                <w:b w:val="false"/>
+                <w:bCs w:val="false"/>
+                <w:sz w:val="20"/>
+                <w:szCs w:val="20"/>
+              </w:rPr>
+              <w:t xml:space="preserve">Group of two-dimensional artworks</w:t>
+            </w:r>
+          </w:p>
+        </w:tc>
+        <w:tc>
+          <w:tcPr>
+            <w:tcW w:type="dxa" w:w="1000"/>
+            <w:tcMar>
+              <w:top w:type="dxa" w:w="60"/>
+              <w:left w:type="dxa" w:w="80"/>
+              <w:bottom w:type="dxa" w:w="60"/>
+              <w:right w:type="dxa" w:w="80"/>
+            </w:tcMar>
+          </w:tcPr>
+          <w:p>
+            <w:r>
+              <w:rPr>
+                <w:rFonts w:ascii="Calibri" w:cs="Calibri" w:eastAsia="Calibri" w:hAnsi="Calibri"/>
+                <w:b w:val="false"/>
+                <w:bCs w:val="false"/>
+                <w:sz w:val="20"/>
+                <w:szCs w:val="20"/>
+              </w:rPr>
+              <w:t xml:space="preserve">$85</w:t>
+            </w:r>
+          </w:p>
+        </w:tc>
+        <w:tc>
+          <w:tcPr>
+            <w:tcW w:type="dxa" w:w="4700"/>
+            <w:tcMar>
+              <w:top w:type="dxa" w:w="60"/>
+              <w:left w:type="dxa" w:w="80"/>
+              <w:bottom w:type="dxa" w:w="60"/>
+              <w:right w:type="dxa" w:w="80"/>
+            </w:tcMar>
+          </w:tcPr>
+          <w:p>
+            <w:r>
+              <w:rPr>
+                <w:rFonts w:ascii="Calibri" w:cs="Calibri" w:eastAsia="Calibri" w:hAnsi="Calibri"/>
+                <w:b w:val="false"/>
+                <w:bCs w:val="false"/>
+                <w:sz w:val="20"/>
+                <w:szCs w:val="20"/>
+              </w:rPr>
+              <w:t xml:space="preserve">The icon set as published artwork, once the app is on sale. Same memory note on the per-group limit.</w:t>
+            </w:r>
+          </w:p>
+        </w:tc>
+      </w:tr>
+      <w:tr>
+        <w:tc>
+          <w:tcPr>
+            <w:tcW w:type="dxa" w:w="4300"/>
+            <w:tcMar>
+              <w:top w:type="dxa" w:w="60"/>
+              <w:left w:type="dxa" w:w="80"/>
+              <w:bottom w:type="dxa" w:w="60"/>
+              <w:right w:type="dxa" w:w="80"/>
+            </w:tcMar>
+          </w:tcPr>
+          <w:p>
+            <w:r>
+              <w:rPr>
+                <w:rFonts w:ascii="Calibri" w:cs="Calibri" w:eastAsia="Calibri" w:hAnsi="Calibri"/>
+                <w:b w:val="false"/>
+                <w:bCs w:val="false"/>
+                <w:sz w:val="20"/>
+                <w:szCs w:val="20"/>
+              </w:rPr>
+              <w:t xml:space="preserve">Paper filing (Forms TX, VA and others)</w:t>
+            </w:r>
+          </w:p>
+        </w:tc>
+        <w:tc>
+          <w:tcPr>
+            <w:tcW w:type="dxa" w:w="1000"/>
+            <w:tcMar>
+              <w:top w:type="dxa" w:w="60"/>
+              <w:left w:type="dxa" w:w="80"/>
+              <w:bottom w:type="dxa" w:w="60"/>
+              <w:right w:type="dxa" w:w="80"/>
+            </w:tcMar>
+          </w:tcPr>
+          <w:p>
+            <w:r>
+              <w:rPr>
+                <w:rFonts w:ascii="Calibri" w:cs="Calibri" w:eastAsia="Calibri" w:hAnsi="Calibri"/>
+                <w:b w:val="false"/>
+                <w:bCs w:val="false"/>
+                <w:sz w:val="20"/>
+                <w:szCs w:val="20"/>
+              </w:rPr>
+              <w:t xml:space="preserve">$125</w:t>
+            </w:r>
+          </w:p>
+        </w:tc>
+        <w:tc>
+          <w:tcPr>
+            <w:tcW w:type="dxa" w:w="4700"/>
+            <w:tcMar>
+              <w:top w:type="dxa" w:w="60"/>
+              <w:left w:type="dxa" w:w="80"/>
+              <w:bottom w:type="dxa" w:w="60"/>
+              <w:right w:type="dxa" w:w="80"/>
+            </w:tcMar>
+          </w:tcPr>
+          <w:p>
+            <w:r>
+              <w:rPr>
+                <w:rFonts w:ascii="Calibri" w:cs="Calibri" w:eastAsia="Calibri" w:hAnsi="Calibri"/>
+                <w:b w:val="false"/>
+                <w:bCs w:val="false"/>
+                <w:sz w:val="20"/>
+                <w:szCs w:val="20"/>
+              </w:rPr>
+              <w:t xml:space="preserve">Avoid. File online.</w:t>
+            </w:r>
+          </w:p>
+        </w:tc>
+      </w:tr>
+      <w:tr>
+        <w:tc>
+          <w:tcPr>
+            <w:tcW w:type="dxa" w:w="4300"/>
+            <w:tcMar>
+              <w:top w:type="dxa" w:w="60"/>
+              <w:left w:type="dxa" w:w="80"/>
+              <w:bottom w:type="dxa" w:w="60"/>
+              <w:right w:type="dxa" w:w="80"/>
+            </w:tcMar>
+          </w:tcPr>
+          <w:p>
+            <w:r>
+              <w:rPr>
+                <w:rFonts w:ascii="Calibri" w:cs="Calibri" w:eastAsia="Calibri" w:hAnsi="Calibri"/>
+                <w:b w:val="false"/>
+                <w:bCs w:val="false"/>
+                <w:sz w:val="20"/>
+                <w:szCs w:val="20"/>
+              </w:rPr>
+              <w:t xml:space="preserve">Recordation of a document, electronic</w:t>
+            </w:r>
+          </w:p>
+        </w:tc>
+        <w:tc>
+          <w:tcPr>
+            <w:tcW w:type="dxa" w:w="1000"/>
+            <w:tcMar>
+              <w:top w:type="dxa" w:w="60"/>
+              <w:left w:type="dxa" w:w="80"/>
+              <w:bottom w:type="dxa" w:w="60"/>
+              <w:right w:type="dxa" w:w="80"/>
+            </w:tcMar>
+          </w:tcPr>
+          <w:p>
+            <w:r>
+              <w:rPr>
+                <w:rFonts w:ascii="Calibri" w:cs="Calibri" w:eastAsia="Calibri" w:hAnsi="Calibri"/>
+                <w:b w:val="false"/>
+                <w:bCs w:val="false"/>
+                <w:sz w:val="20"/>
+                <w:szCs w:val="20"/>
+              </w:rPr>
+              <w:t xml:space="preserve">$95</w:t>
+            </w:r>
+          </w:p>
+        </w:tc>
+        <w:tc>
+          <w:tcPr>
+            <w:tcW w:type="dxa" w:w="4700"/>
+            <w:tcMar>
+              <w:top w:type="dxa" w:w="60"/>
+              <w:left w:type="dxa" w:w="80"/>
+              <w:bottom w:type="dxa" w:w="60"/>
+              <w:right w:type="dxa" w:w="80"/>
+            </w:tcMar>
+          </w:tcPr>
+          <w:p>
+            <w:r>
+              <w:rPr>
+                <w:rFonts w:ascii="Calibri" w:cs="Calibri" w:eastAsia="Calibri" w:hAnsi="Calibri"/>
+                <w:b w:val="false"/>
+                <w:bCs w:val="false"/>
+                <w:sz w:val="20"/>
+                <w:szCs w:val="20"/>
+              </w:rPr>
+              <w:t xml:space="preserve">Optional: recording the assignment from Frank to EZ Voice LLC. Not required for it to be valid.</w:t>
+            </w:r>
+          </w:p>
+        </w:tc>
+      </w:tr>
+      <w:tr>
+        <w:tc>
+          <w:tcPr>
+            <w:tcW w:type="dxa" w:w="4300"/>
+            <w:tcMar>
+              <w:top w:type="dxa" w:w="60"/>
+              <w:left w:type="dxa" w:w="80"/>
+              <w:bottom w:type="dxa" w:w="60"/>
+              <w:right w:type="dxa" w:w="80"/>
+            </w:tcMar>
+          </w:tcPr>
+          <w:p>
+            <w:r>
+              <w:rPr>
+                <w:rFonts w:ascii="Calibri" w:cs="Calibri" w:eastAsia="Calibri" w:hAnsi="Calibri"/>
+                <w:b w:val="false"/>
+                <w:bCs w:val="false"/>
+                <w:sz w:val="20"/>
+                <w:szCs w:val="20"/>
+              </w:rPr>
+              <w:t xml:space="preserve">Supplementary registration (correction)</w:t>
+            </w:r>
+          </w:p>
+        </w:tc>
+        <w:tc>
+          <w:tcPr>
+            <w:tcW w:type="dxa" w:w="1000"/>
+            <w:tcMar>
+              <w:top w:type="dxa" w:w="60"/>
+              <w:left w:type="dxa" w:w="80"/>
+              <w:bottom w:type="dxa" w:w="60"/>
+              <w:right w:type="dxa" w:w="80"/>
+            </w:tcMar>
+          </w:tcPr>
+          <w:p>
+            <w:r>
+              <w:rPr>
+                <w:rFonts w:ascii="Calibri" w:cs="Calibri" w:eastAsia="Calibri" w:hAnsi="Calibri"/>
+                <w:b w:val="false"/>
+                <w:bCs w:val="false"/>
+                <w:sz w:val="20"/>
+                <w:szCs w:val="20"/>
+              </w:rPr>
+              <w:t xml:space="preserve">$100</w:t>
+            </w:r>
+          </w:p>
+        </w:tc>
+        <w:tc>
+          <w:tcPr>
+            <w:tcW w:type="dxa" w:w="4700"/>
+            <w:tcMar>
+              <w:top w:type="dxa" w:w="60"/>
+              <w:left w:type="dxa" w:w="80"/>
+              <w:bottom w:type="dxa" w:w="60"/>
+              <w:right w:type="dxa" w:w="80"/>
+            </w:tcMar>
+          </w:tcPr>
+          <w:p>
+            <w:r>
+              <w:rPr>
+                <w:rFonts w:ascii="Calibri" w:cs="Calibri" w:eastAsia="Calibri" w:hAnsi="Calibri"/>
+                <w:b w:val="false"/>
+                <w:bCs w:val="false"/>
+                <w:sz w:val="20"/>
+                <w:szCs w:val="20"/>
+              </w:rPr>
+              <w:t xml:space="preserve">Only if a registration has to be corrected later.</w:t>
+            </w:r>
+          </w:p>
+        </w:tc>
+      </w:tr>
+    </w:tbl>
     <w:p>
       <w:pPr>
         <w:spacing w:after="120"/>
@@ -1610,7 +2199,20 @@
           <w:sz w:val="22"/>
           <w:szCs w:val="22"/>
         </w:rPr>
-        <w:t xml:space="preserve">copyright.gov is blocked from Claude’s environment. Add copyright.gov and *.copyright.gov to the allow list and the fee page will be read and this section completed with the exact application type and dollar amount for each registration. Until then no figure is quoted here.</w:t>
+        <w:t xml:space="preserve"/>
+      </w:r>
+    </w:p>
+    <w:p>
+      <w:pPr>
+        <w:spacing w:after="120"/>
+      </w:pPr>
+      <w:r>
+        <w:rPr>
+          <w:rFonts w:ascii="Calibri" w:cs="Calibri" w:eastAsia="Calibri" w:hAnsi="Calibri"/>
+          <w:sz w:val="22"/>
+          <w:szCs w:val="22"/>
+        </w:rPr>
+        <w:t xml:space="preserve">Total to register the software and the icon set: $150. Filing is at copyright.gov through the electronic Copyright Office system (eCO; label from memory). Each registration needs a deposit copy: for the program, the portion of source code the Office specifies; for the artwork, image files of each icon.</w:t>
       </w:r>
     </w:p>
     <w:p>
@@ -1949,7 +2551,7 @@
                 <w:sz w:val="20"/>
                 <w:szCs w:val="20"/>
               </w:rPr>
-              <w:t xml:space="preserve">At first sale</w:t>
+              <w:t xml:space="preserve">At first sale, or now</w:t>
             </w:r>
           </w:p>
         </w:tc>
@@ -1972,7 +2574,7 @@
                 <w:sz w:val="20"/>
                 <w:szCs w:val="20"/>
               </w:rPr>
-              <w:t xml:space="preserve">Register the copyright in the software and the icon set</w:t>
+              <w:t xml:space="preserve">Register the copyright in the software ($65) and the icon set ($85)</w:t>
             </w:r>
           </w:p>
         </w:tc>
@@ -1995,7 +2597,7 @@
                 <w:sz w:val="20"/>
                 <w:szCs w:val="20"/>
               </w:rPr>
-              <w:t xml:space="preserve">Unverified</w:t>
+              <w:t xml:space="preserve">$150</w:t>
             </w:r>
           </w:p>
         </w:tc>
@@ -2166,7 +2768,7 @@
           <w:sz w:val="22"/>
           <w:szCs w:val="22"/>
         </w:rPr>
-        <w:t xml:space="preserve">Sources: USPTO trademark fee information page, uspto.gov, read 10 September 2026 (fee schedule effective January 18, 2025). USPTO TSDR record for serial 90648136, read the same day, as the example of an abandoned intent-to-use application. Items marked from memory are not sourced and should be checked on the USPTO or Copyright Office site before relying on them.</w:t>
+        <w:t xml:space="preserve">Sources: USPTO trademark fee information page, uspto.gov, read 10 September 2026 (fee schedule effective January 18, 2025). United States Copyright Office fee page, copyright.gov/about/fees.html, read the same day. USPTO TSDR record for serial 90648136, read the same day, as the example of an abandoned intent-to-use application. Items marked from memory are not sourced and should be checked on the USPTO or Copyright Office site before relying on them.</w:t>
       </w:r>
     </w:p>
     <w:sectPr>

</xml_diff>